<commit_message>
changing title for Reconsideration forms maybe?
</commit_message>
<xml_diff>
--- a/docassemble/AKA2JBranding/data/templates/respond_to_reconsider_content.docx
+++ b/docassemble/AKA2JBranding/data/templates/respond_to_reconsider_content.docx
@@ -328,16 +328,15 @@
         <w:rPr>
           <w:b/>
           <w:bCs/>
-          <w:spacing w:val="-2"/>
         </w:rPr>
-        <w:t>CIV-810</w:t>
+        <w:t>Response to Motion</w:t>
       </w:r>
       <w:r>
         <w:rPr>
           <w:b/>
           <w:bCs/>
         </w:rPr>
-        <w:t xml:space="preserve"> Response to Motion</w:t>
+        <w:t xml:space="preserve"> TF-707</w:t>
       </w:r>
       <w:r>
         <w:rPr>
@@ -370,7 +369,7 @@
           <w:rPr>
             <w:rStyle w:val="Hyperlink"/>
           </w:rPr>
-          <w:t>ak-courts.info/civ810</w:t>
+          <w:t>ak-courts.info/tf707</w:t>
         </w:r>
       </w:hyperlink>
     </w:p>

</xml_diff>